<commit_message>
Upgrade code logic: anti-duplicate subject, fast batch processing, unified New-VnDoc (vn-officecli/templates/to_trinh_hoancau_chuan.docx)
</commit_message>
<xml_diff>
--- a/vn-officecli/templates/to_trinh_hoancau_chuan.docx
+++ b/vn-officecli/templates/to_trinh_hoancau_chuan.docx
@@ -28,7 +28,7 @@
             </w:pPr>
             <w:r>
               <w:rPr>
-                <w:sz w:val="24"/>
+                <w:sz w:val="22"/>
               </w:rPr>
               <w:t xml:space="preserve">CÔNG TY TNHH HOÀN CẦU</w:t>
             </w:r>
@@ -127,12 +127,12 @@
           <w:i/>
           <w:sz w:val="26"/>
         </w:rPr>
-        <w:t xml:space="preserve">V/v: V/v phê duyệt đề xuất chủ trương triển khai hệ thống quản trị 2025/2026</w:t>
-      </w:r>
-    </w:p>
-    <w:p>
-      <w:pPr>
-        <w:spacing w:after="240"/>
+        <w:t xml:space="preserve">V/v: phê duyệt đề xuất chủ trương triển khai hệ thống quản trị 2025/2026</w:t>
+      </w:r>
+    </w:p>
+    <w:p>
+      <w:pPr>
+        <w:spacing w:after="280"/>
         <w:jc w:val="center"/>
       </w:pPr>
       <w:r>
@@ -140,7 +140,7 @@
           <w:i/>
           <w:sz w:val="24"/>
         </w:rPr>
-        <w:t xml:space="preserve">(Trình lần thứ nhất)</w:t>
+        <w:t xml:space="preserve">(Trình lần thứ 1)</w:t>
       </w:r>
     </w:p>
     <w:p>
@@ -157,7 +157,7 @@
     </w:p>
     <w:p>
       <w:pPr>
-        <w:spacing w:before="40" w:after="60" w:line="312" w:lineRule="auto"/>
+        <w:spacing w:before="60" w:after="120" w:line="312" w:lineRule="auto"/>
         <w:ind w:firstLine="709"/>
         <w:jc w:val="both"/>
       </w:pPr>
@@ -170,20 +170,20 @@
     </w:p>
     <w:p>
       <w:pPr>
-        <w:spacing w:before="40" w:after="120" w:line="312" w:lineRule="auto"/>
-        <w:ind w:firstLine="709"/>
-        <w:jc w:val="both"/>
-      </w:pPr>
-      <w:r>
-        <w:rPr>
-          <w:sz w:val="26"/>
-        </w:rPr>
-        <w:t xml:space="preserve">- Căn cứ chức năng, nhiệm vụ và nhu cầu thực tế trong công tác điều hành, vận hành hoạt động của PHÒNG CÔNG NGHỆ VÀ VẬN HÀNH;</w:t>
-      </w:r>
-    </w:p>
-    <w:p>
-      <w:pPr>
-        <w:spacing w:before="60" w:after="160" w:line="312" w:lineRule="auto"/>
+        <w:spacing w:before="60" w:after="120" w:line="312" w:lineRule="auto"/>
+        <w:ind w:firstLine="709"/>
+        <w:jc w:val="both"/>
+      </w:pPr>
+      <w:r>
+        <w:rPr>
+          <w:sz w:val="26"/>
+        </w:rPr>
+        <w:t xml:space="preserve">- Căn cứ chức năng, nhiệm vụ và nhu cầu thực tế trong công tác quản trị, điều hành hoạt động của PHÒNG CÔNG NGHỆ VÀ VẬN HÀNH;</w:t>
+      </w:r>
+    </w:p>
+    <w:p>
+      <w:pPr>
+        <w:spacing w:before="60" w:after="120" w:line="312" w:lineRule="auto"/>
         <w:ind w:firstLine="709"/>
         <w:jc w:val="both"/>
       </w:pPr>
@@ -216,20 +216,20 @@
         <w:rPr>
           <w:sz w:val="26"/>
         </w:rPr>
-        <w:t xml:space="preserve">1. Bối cảnh và lý do đề xuất: Nêu rõ thực trạng công việc, những vấn đề tồn tại, bất cập hoặc những cơ hội mới đòi hỏi phải ban hành quy chế hoặc đầu tư dự án.</w:t>
-      </w:r>
-    </w:p>
-    <w:p>
-      <w:pPr>
-        <w:spacing w:before="60" w:after="120" w:line="312" w:lineRule="auto"/>
-        <w:ind w:firstLine="709"/>
-        <w:jc w:val="both"/>
-      </w:pPr>
-      <w:r>
-        <w:rPr>
-          <w:sz w:val="26"/>
-        </w:rPr>
-        <w:t xml:space="preserve">2. Mục tiêu hướng tới: Nâng cao hiệu quả phối hợp công tác, tối ưu hóa thời gian xử lý thủ tục, tiết kiệm chi phí và đảm bảo tuân thủ hành lang pháp lý chặt chẽ.</w:t>
+        <w:t xml:space="preserve">1. Bối cảnh và lý do đề xuất: Nêu rõ thực trạng công việc, các khó khăn bất cập tồn tại hoặc cơ hội phát triển mới đòi hỏi phải thực hiện đề xuất.</w:t>
+      </w:r>
+    </w:p>
+    <w:p>
+      <w:pPr>
+        <w:spacing w:before="60" w:after="120" w:line="312" w:lineRule="auto"/>
+        <w:ind w:firstLine="709"/>
+        <w:jc w:val="both"/>
+      </w:pPr>
+      <w:r>
+        <w:rPr>
+          <w:sz w:val="26"/>
+        </w:rPr>
+        <w:t xml:space="preserve">2. Mục tiêu hướng tới: Tối ưu hóa hiệu quả vận hành, tiết giảm chi phí, nâng cao năng suất lao động và đảm bảo tuân thủ nghiêm ngặt các quy định pháp luật.</w:t>
       </w:r>
     </w:p>
     <w:p>
@@ -254,33 +254,33 @@
         <w:rPr>
           <w:sz w:val="26"/>
         </w:rPr>
-        <w:t xml:space="preserve">1. Nội dung chi tiết phương án: Trình bày các giải pháp cụ thể, lộ trình thực hiện, danh mục hạng mục đầu tư hoặc nội dung sửa đổi quy chế.</w:t>
-      </w:r>
-    </w:p>
-    <w:p>
-      <w:pPr>
-        <w:spacing w:before="60" w:after="120" w:line="312" w:lineRule="auto"/>
-        <w:ind w:firstLine="709"/>
-        <w:jc w:val="both"/>
-      </w:pPr>
-      <w:r>
-        <w:rPr>
-          <w:sz w:val="26"/>
-        </w:rPr>
-        <w:t xml:space="preserve">2. Dự toán ngân sách và nguồn lực thực hiện: Bảng tổng hợp chi phí đầu tư, phân kỳ giải ngân và nguồn vốn dự kiến sử dụng.</w:t>
-      </w:r>
-    </w:p>
-    <w:p>
-      <w:pPr>
-        <w:spacing w:before="60" w:after="120" w:line="312" w:lineRule="auto"/>
-        <w:ind w:firstLine="709"/>
-        <w:jc w:val="both"/>
-      </w:pPr>
-      <w:r>
-        <w:rPr>
-          <w:sz w:val="26"/>
-        </w:rPr>
-        <w:t xml:space="preserve">3. Kế hoạch tiến độ và đơn vị chịu trách nhiệm: Phân công đơn vị chủ trì, đơn vị phối hợp và các mốc thời gian hoàn thành cụ thể.</w:t>
+        <w:t xml:space="preserve">1. Nội dung chi tiết phương án: Trình bày chi tiết các giải pháp kỹ thuật, phạm vi áp dụng, tiêu chuẩn lựa chọn và quy trình thực hiện.</w:t>
+      </w:r>
+    </w:p>
+    <w:p>
+      <w:pPr>
+        <w:spacing w:before="60" w:after="120" w:line="312" w:lineRule="auto"/>
+        <w:ind w:firstLine="709"/>
+        <w:jc w:val="both"/>
+      </w:pPr>
+      <w:r>
+        <w:rPr>
+          <w:sz w:val="26"/>
+        </w:rPr>
+        <w:t xml:space="preserve">2. Dự toán ngân sách và nguồn lực: Bảng tổng hợp khái toán kinh phí, nhân sự tham gia triển khai và kế hoạch phân kỳ giải ngân vốn.</w:t>
+      </w:r>
+    </w:p>
+    <w:p>
+      <w:pPr>
+        <w:spacing w:before="60" w:after="120" w:line="312" w:lineRule="auto"/>
+        <w:ind w:firstLine="709"/>
+        <w:jc w:val="both"/>
+      </w:pPr>
+      <w:r>
+        <w:rPr>
+          <w:sz w:val="26"/>
+        </w:rPr>
+        <w:t xml:space="preserve">3. Tiến độ thực hiện: Lộ trình triển khai cụ thể theo từng mốc thời gian từ khâu chuẩn bị, thẩm định đến hoàn thành bàn giao nghiệm thu.</w:t>
       </w:r>
     </w:p>
     <w:p>
@@ -305,38 +305,38 @@
         <w:rPr>
           <w:sz w:val="26"/>
         </w:rPr>
-        <w:t xml:space="preserve">Để đảm bảo hoạt động được triển khai thông suốt, đúng tiến độ và đạt hiệu quả cao, PHÒNG CÔNG NGHỆ VÀ VẬN HÀNH kính đề nghị Hội đồng Thành viên / Ban Tổng Giám đốc Tập đoàn Hoàn Cầu xem xét và quyết định:</w:t>
-      </w:r>
-    </w:p>
-    <w:p>
-      <w:pPr>
-        <w:spacing w:before="60" w:after="80" w:line="312" w:lineRule="auto"/>
-        <w:ind w:firstLine="709"/>
-        <w:jc w:val="both"/>
-      </w:pPr>
-      <w:r>
-        <w:rPr>
-          <w:sz w:val="26"/>
-        </w:rPr>
-        <w:t xml:space="preserve">1. Phê duyệt chủ trương và phương án triển khai chi tiết nêu tại Phần II.</w:t>
-      </w:r>
-    </w:p>
-    <w:p>
-      <w:pPr>
-        <w:spacing w:before="60" w:after="120" w:line="312" w:lineRule="auto"/>
-        <w:ind w:firstLine="709"/>
-        <w:jc w:val="both"/>
-      </w:pPr>
-      <w:r>
-        <w:rPr>
-          <w:sz w:val="26"/>
-        </w:rPr>
-        <w:t xml:space="preserve">2. Phê duyệt dự toán kinh phí và giao các đơn vị liên quan phối hợp thực hiện theo đúng thẩm quyền.</w:t>
-      </w:r>
-    </w:p>
-    <w:p>
-      <w:pPr>
-        <w:spacing w:before="80" w:after="360" w:line="312" w:lineRule="auto"/>
+        <w:t xml:space="preserve">Để đảm bảo tiến độ triển khai thông suốt và đạt hiệu quả tối ưu, PHÒNG CÔNG NGHỆ VÀ VẬN HÀNH kính đề nghị Hội đồng Thành viên / Ban Tổng Giám đốc Tập đoàn Hoàn Cầu xem xét và quyết định:</w:t>
+      </w:r>
+    </w:p>
+    <w:p>
+      <w:pPr>
+        <w:spacing w:before="60" w:after="120" w:line="312" w:lineRule="auto"/>
+        <w:ind w:firstLine="709"/>
+        <w:jc w:val="both"/>
+      </w:pPr>
+      <w:r>
+        <w:rPr>
+          <w:sz w:val="26"/>
+        </w:rPr>
+        <w:t xml:space="preserve">1. Phê duyệt chủ trương và phương án triển khai chi tiết theo nội dung nêu tại Phần II.</w:t>
+      </w:r>
+    </w:p>
+    <w:p>
+      <w:pPr>
+        <w:spacing w:before="60" w:after="120" w:line="312" w:lineRule="auto"/>
+        <w:ind w:firstLine="709"/>
+        <w:jc w:val="both"/>
+      </w:pPr>
+      <w:r>
+        <w:rPr>
+          <w:sz w:val="26"/>
+        </w:rPr>
+        <w:t xml:space="preserve">2. Phê duyệt dự toán kinh phí thực hiện và giao các phòng ban, đơn vị liên quan phối hợp triển khai theo đúng thẩm quyền.</w:t>
+      </w:r>
+    </w:p>
+    <w:p>
+      <w:pPr>
+        <w:spacing w:before="60" w:after="360" w:line="312" w:lineRule="auto"/>
         <w:ind w:firstLine="709"/>
         <w:jc w:val="both"/>
       </w:pPr>
@@ -467,7 +467,7 @@
                 <w:i/>
                 <w:sz w:val="20"/>
               </w:rPr>
-              <w:t xml:space="preserve">- Bảng phân tích dự toán ngân sách và hiệu quả đầu tư;</w:t>
+              <w:t xml:space="preserve">- Bảng dự toán kinh phí và hiệu quả đầu tư;</w:t>
             </w:r>
           </w:p>
           <w:p>
@@ -479,7 +479,7 @@
                 <w:i/>
                 <w:sz w:val="20"/>
               </w:rPr>
-              <w:t xml:space="preserve">- Báo giá của các đối tác cung cấp.</w:t>
+              <w:t xml:space="preserve">- Báo giá đối tác cung cấp.</w:t>
             </w:r>
           </w:p>
         </w:tc>
@@ -549,7 +549,7 @@
     </w:p>
     <w:p>
       <w:pPr>
-        <w:spacing w:after="240"/>
+        <w:spacing w:after="200"/>
       </w:pPr>
       <w:r>
         <w:rPr>
@@ -560,7 +560,7 @@
     </w:p>
     <w:p>
       <w:pPr>
-        <w:spacing w:before="160" w:after="80"/>
+        <w:spacing w:before="120" w:after="80"/>
       </w:pPr>
       <w:r>
         <w:rPr>

</xml_diff>